<commit_message>
Integración de Índice de tablas
</commit_message>
<xml_diff>
--- a/TESIS FERNANDA NICOLE DUBON REYNOSO.docx
+++ b/TESIS FERNANDA NICOLE DUBON REYNOSO.docx
@@ -11,7 +11,7 @@
           <w:noProof/>
         </w:rPr>
         <w:drawing>
-          <wp:anchor distT="0" distB="0" distL="114300" distR="114300" simplePos="0" relativeHeight="251661312" behindDoc="0" locked="0" layoutInCell="1" allowOverlap="1" wp14:anchorId="4CE431EF" wp14:editId="21DD5AD8">
+          <wp:anchor distT="0" distB="0" distL="114300" distR="114300" simplePos="0" relativeHeight="251661312" behindDoc="0" locked="0" layoutInCell="1" allowOverlap="1" wp14:anchorId="4CE431EF" wp14:editId="422C8F50">
             <wp:simplePos x="0" y="0"/>
             <wp:positionH relativeFrom="column">
               <wp:posOffset>1733550</wp:posOffset>
@@ -1675,7 +1675,25 @@
           <w:szCs w:val="24"/>
           <w:lang w:val="es-ES"/>
         </w:rPr>
-        <w:t>Los abajo firmantes damos fe, en nuestra posición de miembro de Terna, Asesor y/o Jefe Académico y en el marco de nuestras responsabilidades adquiridas, que el presente documento cumple con los lineamientos exigidos por la Facultad de Ingeniería y Arquitectura y los requerimientos académicos que la Universidad dispone dentro de los procesos de graduación.</w:t>
+        <w:t xml:space="preserve">Los abajo firmantes damos fe, en nuestra posición de miembro de Terna, Asesor y/o </w:t>
+      </w:r>
+      <w:proofErr w:type="gramStart"/>
+      <w:r>
+        <w:rPr>
+          <w:rFonts w:eastAsia="Times New Roman" w:cs="Times New Roman"/>
+          <w:szCs w:val="24"/>
+          <w:lang w:val="es-ES"/>
+        </w:rPr>
+        <w:t>Jefe</w:t>
+      </w:r>
+      <w:proofErr w:type="gramEnd"/>
+      <w:r>
+        <w:rPr>
+          <w:rFonts w:eastAsia="Times New Roman" w:cs="Times New Roman"/>
+          <w:szCs w:val="24"/>
+          <w:lang w:val="es-ES"/>
+        </w:rPr>
+        <w:t xml:space="preserve"> Académico y en el marco de nuestras responsabilidades adquiridas, que el presente documento cumple con los lineamientos exigidos por la Facultad de Ingeniería y Arquitectura y los requerimientos académicos que la Universidad dispone dentro de los procesos de graduación.</w:t>
       </w:r>
     </w:p>
     <w:p>
@@ -2550,7 +2568,7 @@
         </w:rPr>
         <w:lastRenderedPageBreak/>
         <w:drawing>
-          <wp:inline distT="0" distB="0" distL="0" distR="0" wp14:anchorId="7B442253" wp14:editId="16E6732E">
+          <wp:inline distT="0" distB="0" distL="0" distR="0" wp14:anchorId="7B442253" wp14:editId="7FC84C85">
             <wp:extent cx="2482215" cy="675005"/>
             <wp:effectExtent l="0" t="0" r="0" b="0"/>
             <wp:docPr id="2001976741" name="Picture 1" descr="Centro Universitario Tecnológico | Universidad Ceutec Honduras"/>
@@ -3009,7 +3027,7 @@
         </w:rPr>
         <w:lastRenderedPageBreak/>
         <w:drawing>
-          <wp:inline distT="0" distB="0" distL="0" distR="0" wp14:anchorId="7826E88D" wp14:editId="088FFCEB">
+          <wp:inline distT="0" distB="0" distL="0" distR="0" wp14:anchorId="7826E88D" wp14:editId="058CA5FB">
             <wp:extent cx="2482215" cy="675005"/>
             <wp:effectExtent l="0" t="0" r="0" b="0"/>
             <wp:docPr id="1635753813" name="Picture 1" descr="Centro Universitario Tecnológico | Universidad Ceutec Honduras"/>
@@ -9734,12 +9752,129 @@
     </w:sdt>
     <w:p>
       <w:pPr>
-        <w:pStyle w:val="ParrafoCeutec"/>
+        <w:jc w:val="center"/>
+        <w:rPr>
+          <w:b/>
+          <w:bCs/>
+          <w:lang w:val="es-HN"/>
+        </w:rPr>
+      </w:pPr>
+      <w:r>
+        <w:rPr>
+          <w:b/>
+          <w:bCs/>
+          <w:lang w:val="es-HN"/>
+        </w:rPr>
+        <w:t>Índice de Tablas</w:t>
+      </w:r>
+    </w:p>
+    <w:p>
+      <w:pPr>
+        <w:pStyle w:val="Tabladeilustraciones"/>
+        <w:tabs>
+          <w:tab w:val="right" w:leader="dot" w:pos="9350"/>
+        </w:tabs>
+        <w:rPr>
+          <w:rFonts w:asciiTheme="minorHAnsi" w:eastAsiaTheme="minorEastAsia" w:hAnsiTheme="minorHAnsi"/>
+          <w:noProof/>
+          <w:szCs w:val="24"/>
+          <w:lang w:val="es-HN" w:eastAsia="es-HN"/>
+        </w:rPr>
+      </w:pPr>
+      <w:r>
         <w:rPr>
           <w:rFonts w:eastAsia="Aptos"/>
           <w:lang w:val="es-HN"/>
         </w:rPr>
-      </w:pPr>
+        <w:fldChar w:fldCharType="begin"/>
+      </w:r>
+      <w:r>
+        <w:rPr>
+          <w:rFonts w:eastAsia="Aptos"/>
+          <w:lang w:val="es-HN"/>
+        </w:rPr>
+        <w:instrText xml:space="preserve"> TOC \h \z \c "Tabla" </w:instrText>
+      </w:r>
+      <w:r>
+        <w:rPr>
+          <w:rFonts w:eastAsia="Aptos"/>
+          <w:lang w:val="es-HN"/>
+        </w:rPr>
+        <w:fldChar w:fldCharType="separate"/>
+      </w:r>
+      <w:hyperlink w:anchor="_Toc243920924" w:history="1">
+        <w:r>
+          <w:rPr>
+            <w:rStyle w:val="Hipervnculo"/>
+            <w:noProof/>
+          </w:rPr>
+          <w:t>Tabla 1: Muestra y Población</w:t>
+        </w:r>
+        <w:r>
+          <w:rPr>
+            <w:noProof/>
+            <w:webHidden/>
+          </w:rPr>
+          <w:tab/>
+        </w:r>
+        <w:r>
+          <w:rPr>
+            <w:noProof/>
+            <w:webHidden/>
+          </w:rPr>
+          <w:fldChar w:fldCharType="begin"/>
+        </w:r>
+        <w:r>
+          <w:rPr>
+            <w:noProof/>
+            <w:webHidden/>
+          </w:rPr>
+          <w:instrText xml:space="preserve"> PAGEREF _Toc243920924 \h </w:instrText>
+        </w:r>
+        <w:r>
+          <w:rPr>
+            <w:noProof/>
+            <w:webHidden/>
+          </w:rPr>
+        </w:r>
+        <w:r>
+          <w:rPr>
+            <w:noProof/>
+            <w:webHidden/>
+          </w:rPr>
+          <w:fldChar w:fldCharType="separate"/>
+        </w:r>
+        <w:r>
+          <w:rPr>
+            <w:noProof/>
+            <w:webHidden/>
+          </w:rPr>
+          <w:t>11</w:t>
+        </w:r>
+        <w:r>
+          <w:rPr>
+            <w:noProof/>
+            <w:webHidden/>
+          </w:rPr>
+          <w:fldChar w:fldCharType="end"/>
+        </w:r>
+      </w:hyperlink>
+    </w:p>
+    <w:p>
+      <w:pPr>
+        <w:pStyle w:val="ParrafoCeutec"/>
+        <w:rPr>
+          <w:rFonts w:eastAsia="Aptos"/>
+          <w:lang w:val="es-HN"/>
+        </w:rPr>
+      </w:pPr>
+      <w:r>
+        <w:rPr>
+          <w:rFonts w:eastAsia="Aptos"/>
+          <w:lang w:val="es-HN"/>
+        </w:rPr>
+        <w:fldChar w:fldCharType="end"/>
+      </w:r>
     </w:p>
     <w:p>
       <w:pPr>
@@ -10328,7 +10463,21 @@
         <w:rPr>
           <w:lang w:val="es-ES_tradnl"/>
         </w:rPr>
-        <w:t>Proceso automático que se ejecuta a una hora o frecuencia fija, por ejemplo avisar de un aniversario cada día a las 7:00.</w:t>
+        <w:t xml:space="preserve">Proceso automático que se ejecuta a una hora o frecuencia fija, por </w:t>
+      </w:r>
+      <w:proofErr w:type="gramStart"/>
+      <w:r>
+        <w:rPr>
+          <w:lang w:val="es-ES_tradnl"/>
+        </w:rPr>
+        <w:t>ejemplo</w:t>
+      </w:r>
+      <w:proofErr w:type="gramEnd"/>
+      <w:r>
+        <w:rPr>
+          <w:lang w:val="es-ES_tradnl"/>
+        </w:rPr>
+        <w:t xml:space="preserve"> avisar de un aniversario cada día a las 7:00.</w:t>
       </w:r>
     </w:p>
     <w:p>
@@ -11138,7 +11287,21 @@
         <w:rPr>
           <w:lang w:val="es-ES_tradnl"/>
         </w:rPr>
-        <w:t xml:space="preserve"> que se ejecuta antes de la lógica principal de una ruta, por ejemplo para verificar el token o los permisos.</w:t>
+        <w:t xml:space="preserve"> que se ejecuta antes de la lógica principal de una ruta, por </w:t>
+      </w:r>
+      <w:proofErr w:type="gramStart"/>
+      <w:r>
+        <w:rPr>
+          <w:lang w:val="es-ES_tradnl"/>
+        </w:rPr>
+        <w:t>ejemplo</w:t>
+      </w:r>
+      <w:proofErr w:type="gramEnd"/>
+      <w:r>
+        <w:rPr>
+          <w:lang w:val="es-ES_tradnl"/>
+        </w:rPr>
+        <w:t xml:space="preserve"> para verificar el token o los permisos.</w:t>
       </w:r>
     </w:p>
     <w:p>
@@ -11346,7 +11509,21 @@
         <w:rPr>
           <w:lang w:val="es-ES_tradnl"/>
         </w:rPr>
-        <w:t xml:space="preserve"> que representa una respuesta futura, por ejemplo la de una petición al </w:t>
+        <w:t xml:space="preserve"> que representa una respuesta futura, por </w:t>
+      </w:r>
+      <w:proofErr w:type="gramStart"/>
+      <w:r>
+        <w:rPr>
+          <w:lang w:val="es-ES_tradnl"/>
+        </w:rPr>
+        <w:t>ejemplo</w:t>
+      </w:r>
+      <w:proofErr w:type="gramEnd"/>
+      <w:r>
+        <w:rPr>
+          <w:lang w:val="es-ES_tradnl"/>
+        </w:rPr>
+        <w:t xml:space="preserve"> la de una petición al </w:t>
       </w:r>
       <w:proofErr w:type="spellStart"/>
       <w:r>
@@ -11623,7 +11800,21 @@
         <w:rPr>
           <w:lang w:val="es-ES_tradnl"/>
         </w:rPr>
-        <w:t xml:space="preserve">Conjunto de permisos de acceso que define lo que un usuario puede ver y hacer (por ejemplo </w:t>
+        <w:t xml:space="preserve">Conjunto de permisos de acceso que define lo que un usuario puede ver y hacer (por </w:t>
+      </w:r>
+      <w:proofErr w:type="gramStart"/>
+      <w:r>
+        <w:rPr>
+          <w:lang w:val="es-ES_tradnl"/>
+        </w:rPr>
+        <w:t>ejemplo</w:t>
+      </w:r>
+      <w:proofErr w:type="gramEnd"/>
+      <w:r>
+        <w:rPr>
+          <w:lang w:val="es-ES_tradnl"/>
+        </w:rPr>
+        <w:t xml:space="preserve"> </w:t>
       </w:r>
       <w:proofErr w:type="spellStart"/>
       <w:r>
@@ -11637,7 +11828,21 @@
         <w:rPr>
           <w:lang w:val="es-ES_tradnl"/>
         </w:rPr>
-        <w:t>, RRHH, Jefe de área).</w:t>
+        <w:t xml:space="preserve">, RRHH, </w:t>
+      </w:r>
+      <w:proofErr w:type="gramStart"/>
+      <w:r>
+        <w:rPr>
+          <w:lang w:val="es-ES_tradnl"/>
+        </w:rPr>
+        <w:t>Jefe</w:t>
+      </w:r>
+      <w:proofErr w:type="gramEnd"/>
+      <w:r>
+        <w:rPr>
+          <w:lang w:val="es-ES_tradnl"/>
+        </w:rPr>
+        <w:t xml:space="preserve"> de área).</w:t>
       </w:r>
     </w:p>
     <w:p>
@@ -12004,7 +12209,14 @@
         <w:rPr>
           <w:lang w:val="es-ES_tradnl"/>
         </w:rPr>
-        <w:t>Valor de configuración (como una clave o una dirección) que se guarda fuera del código, en el archivo .</w:t>
+        <w:t xml:space="preserve">Valor de configuración (como una clave o una dirección) que se guarda fuera del código, en el </w:t>
+      </w:r>
+      <w:proofErr w:type="gramStart"/>
+      <w:r>
+        <w:rPr>
+          <w:lang w:val="es-ES_tradnl"/>
+        </w:rPr>
+        <w:t>archivo .</w:t>
       </w:r>
       <w:proofErr w:type="spellStart"/>
       <w:r>
@@ -12014,6 +12226,7 @@
         <w:t>env</w:t>
       </w:r>
       <w:proofErr w:type="spellEnd"/>
+      <w:proofErr w:type="gramEnd"/>
       <w:r>
         <w:rPr>
           <w:lang w:val="es-ES_tradnl"/>
@@ -13060,274 +13273,573 @@
     </w:p>
     <w:p>
       <w:pPr>
+        <w:pStyle w:val="Descripcin"/>
+        <w:keepNext/>
+      </w:pPr>
+      <w:bookmarkStart w:id="51" w:name="_Toc243920924"/>
+      <w:proofErr w:type="spellStart"/>
+      <w:r>
+        <w:t>Tabla</w:t>
+      </w:r>
+      <w:proofErr w:type="spellEnd"/>
+      <w:r>
+        <w:t xml:space="preserve"> </w:t>
+      </w:r>
+      <w:r>
+        <w:fldChar w:fldCharType="begin"/>
+      </w:r>
+      <w:r>
+        <w:instrText xml:space="preserve"> SEQ Tabla \* ARABIC </w:instrText>
+      </w:r>
+      <w:r>
+        <w:fldChar w:fldCharType="separate"/>
+      </w:r>
+      <w:r>
+        <w:rPr>
+          <w:noProof/>
+        </w:rPr>
+        <w:t>1</w:t>
+      </w:r>
+      <w:r>
+        <w:fldChar w:fldCharType="end"/>
+      </w:r>
+      <w:r>
+        <w:t xml:space="preserve">: </w:t>
+      </w:r>
+      <w:proofErr w:type="spellStart"/>
+      <w:r>
+        <w:t>Muestra</w:t>
+      </w:r>
+      <w:proofErr w:type="spellEnd"/>
+      <w:r>
+        <w:t xml:space="preserve"> y Población</w:t>
+      </w:r>
+      <w:bookmarkEnd w:id="51"/>
+    </w:p>
+    <w:tbl>
+      <w:tblPr>
+        <w:tblStyle w:val="Tablaconcuadrcula"/>
+        <w:tblW w:w="0" w:type="auto"/>
+        <w:tblLook w:val="04A0" w:firstRow="1" w:lastRow="0" w:firstColumn="1" w:lastColumn="0" w:noHBand="0" w:noVBand="1"/>
+      </w:tblPr>
+      <w:tblGrid>
+        <w:gridCol w:w="3116"/>
+        <w:gridCol w:w="3117"/>
+        <w:gridCol w:w="3117"/>
+      </w:tblGrid>
+      <w:tr>
+        <w:tc>
+          <w:tcPr>
+            <w:tcW w:w="3116" w:type="dxa"/>
+          </w:tcPr>
+          <w:p>
+            <w:pPr>
+              <w:rPr>
+                <w:lang w:val="es-ES_tradnl"/>
+              </w:rPr>
+            </w:pPr>
+          </w:p>
+        </w:tc>
+        <w:tc>
+          <w:tcPr>
+            <w:tcW w:w="3117" w:type="dxa"/>
+          </w:tcPr>
+          <w:p>
+            <w:pPr>
+              <w:rPr>
+                <w:lang w:val="es-ES_tradnl"/>
+              </w:rPr>
+            </w:pPr>
+          </w:p>
+        </w:tc>
+        <w:tc>
+          <w:tcPr>
+            <w:tcW w:w="3117" w:type="dxa"/>
+          </w:tcPr>
+          <w:p>
+            <w:pPr>
+              <w:rPr>
+                <w:lang w:val="es-ES_tradnl"/>
+              </w:rPr>
+            </w:pPr>
+          </w:p>
+        </w:tc>
+      </w:tr>
+      <w:tr>
+        <w:tc>
+          <w:tcPr>
+            <w:tcW w:w="3116" w:type="dxa"/>
+          </w:tcPr>
+          <w:p>
+            <w:pPr>
+              <w:rPr>
+                <w:lang w:val="es-ES_tradnl"/>
+              </w:rPr>
+            </w:pPr>
+          </w:p>
+        </w:tc>
+        <w:tc>
+          <w:tcPr>
+            <w:tcW w:w="3117" w:type="dxa"/>
+          </w:tcPr>
+          <w:p>
+            <w:pPr>
+              <w:rPr>
+                <w:lang w:val="es-ES_tradnl"/>
+              </w:rPr>
+            </w:pPr>
+          </w:p>
+        </w:tc>
+        <w:tc>
+          <w:tcPr>
+            <w:tcW w:w="3117" w:type="dxa"/>
+          </w:tcPr>
+          <w:p>
+            <w:pPr>
+              <w:rPr>
+                <w:lang w:val="es-ES_tradnl"/>
+              </w:rPr>
+            </w:pPr>
+          </w:p>
+        </w:tc>
+      </w:tr>
+      <w:tr>
+        <w:tc>
+          <w:tcPr>
+            <w:tcW w:w="3116" w:type="dxa"/>
+          </w:tcPr>
+          <w:p>
+            <w:pPr>
+              <w:rPr>
+                <w:lang w:val="es-ES_tradnl"/>
+              </w:rPr>
+            </w:pPr>
+          </w:p>
+        </w:tc>
+        <w:tc>
+          <w:tcPr>
+            <w:tcW w:w="3117" w:type="dxa"/>
+          </w:tcPr>
+          <w:p>
+            <w:pPr>
+              <w:rPr>
+                <w:lang w:val="es-ES_tradnl"/>
+              </w:rPr>
+            </w:pPr>
+          </w:p>
+        </w:tc>
+        <w:tc>
+          <w:tcPr>
+            <w:tcW w:w="3117" w:type="dxa"/>
+          </w:tcPr>
+          <w:p>
+            <w:pPr>
+              <w:rPr>
+                <w:lang w:val="es-ES_tradnl"/>
+              </w:rPr>
+            </w:pPr>
+          </w:p>
+        </w:tc>
+      </w:tr>
+      <w:tr>
+        <w:tc>
+          <w:tcPr>
+            <w:tcW w:w="3116" w:type="dxa"/>
+          </w:tcPr>
+          <w:p>
+            <w:pPr>
+              <w:rPr>
+                <w:lang w:val="es-ES_tradnl"/>
+              </w:rPr>
+            </w:pPr>
+          </w:p>
+        </w:tc>
+        <w:tc>
+          <w:tcPr>
+            <w:tcW w:w="3117" w:type="dxa"/>
+          </w:tcPr>
+          <w:p>
+            <w:pPr>
+              <w:rPr>
+                <w:lang w:val="es-ES_tradnl"/>
+              </w:rPr>
+            </w:pPr>
+          </w:p>
+        </w:tc>
+        <w:tc>
+          <w:tcPr>
+            <w:tcW w:w="3117" w:type="dxa"/>
+          </w:tcPr>
+          <w:p>
+            <w:pPr>
+              <w:rPr>
+                <w:lang w:val="es-ES_tradnl"/>
+              </w:rPr>
+            </w:pPr>
+          </w:p>
+        </w:tc>
+      </w:tr>
+      <w:tr>
+        <w:tc>
+          <w:tcPr>
+            <w:tcW w:w="3116" w:type="dxa"/>
+          </w:tcPr>
+          <w:p>
+            <w:pPr>
+              <w:rPr>
+                <w:lang w:val="es-ES_tradnl"/>
+              </w:rPr>
+            </w:pPr>
+          </w:p>
+        </w:tc>
+        <w:tc>
+          <w:tcPr>
+            <w:tcW w:w="3117" w:type="dxa"/>
+          </w:tcPr>
+          <w:p>
+            <w:pPr>
+              <w:rPr>
+                <w:lang w:val="es-ES_tradnl"/>
+              </w:rPr>
+            </w:pPr>
+          </w:p>
+        </w:tc>
+        <w:tc>
+          <w:tcPr>
+            <w:tcW w:w="3117" w:type="dxa"/>
+          </w:tcPr>
+          <w:p>
+            <w:pPr>
+              <w:rPr>
+                <w:lang w:val="es-ES_tradnl"/>
+              </w:rPr>
+            </w:pPr>
+          </w:p>
+        </w:tc>
+      </w:tr>
+      <w:tr>
+        <w:tc>
+          <w:tcPr>
+            <w:tcW w:w="3116" w:type="dxa"/>
+          </w:tcPr>
+          <w:p>
+            <w:pPr>
+              <w:rPr>
+                <w:lang w:val="es-ES_tradnl"/>
+              </w:rPr>
+            </w:pPr>
+          </w:p>
+        </w:tc>
+        <w:tc>
+          <w:tcPr>
+            <w:tcW w:w="3117" w:type="dxa"/>
+          </w:tcPr>
+          <w:p>
+            <w:pPr>
+              <w:rPr>
+                <w:lang w:val="es-ES_tradnl"/>
+              </w:rPr>
+            </w:pPr>
+          </w:p>
+        </w:tc>
+        <w:tc>
+          <w:tcPr>
+            <w:tcW w:w="3117" w:type="dxa"/>
+          </w:tcPr>
+          <w:p>
+            <w:pPr>
+              <w:rPr>
+                <w:lang w:val="es-ES_tradnl"/>
+              </w:rPr>
+            </w:pPr>
+          </w:p>
+        </w:tc>
+      </w:tr>
+    </w:tbl>
+    <w:p>
+      <w:pPr>
+        <w:rPr>
+          <w:lang w:val="es-ES_tradnl"/>
+        </w:rPr>
+      </w:pPr>
+    </w:p>
+    <w:p>
+      <w:pPr>
         <w:pStyle w:val="Ttulo2"/>
       </w:pPr>
-      <w:bookmarkStart w:id="51" w:name="_Toc243321368"/>
-      <w:r>
+      <w:bookmarkStart w:id="52" w:name="_Toc243321368"/>
+      <w:r>
+        <w:lastRenderedPageBreak/>
         <w:t>Técnicas e Instrumentos de Investigación</w:t>
       </w:r>
-      <w:bookmarkEnd w:id="51"/>
+      <w:bookmarkEnd w:id="52"/>
     </w:p>
     <w:p>
       <w:pPr>
         <w:pStyle w:val="Ttulo3"/>
       </w:pPr>
-      <w:bookmarkStart w:id="52" w:name="_Toc243321369"/>
+      <w:bookmarkStart w:id="53" w:name="_Toc243321369"/>
       <w:r>
         <w:t>Encuesta</w:t>
       </w:r>
-      <w:bookmarkEnd w:id="52"/>
+      <w:bookmarkEnd w:id="53"/>
     </w:p>
     <w:p>
       <w:pPr>
         <w:pStyle w:val="Ttulo2"/>
       </w:pPr>
-      <w:bookmarkStart w:id="53" w:name="_Toc243321370"/>
+      <w:bookmarkStart w:id="54" w:name="_Toc243321370"/>
       <w:r>
         <w:t>Fuentes de Información</w:t>
       </w:r>
-      <w:bookmarkEnd w:id="53"/>
+      <w:bookmarkEnd w:id="54"/>
     </w:p>
     <w:p>
       <w:pPr>
         <w:pStyle w:val="Ttulo3"/>
       </w:pPr>
-      <w:bookmarkStart w:id="54" w:name="_Toc243321371"/>
+      <w:bookmarkStart w:id="55" w:name="_Toc243321371"/>
       <w:r>
         <w:t>Fuentes Primarias</w:t>
       </w:r>
-      <w:bookmarkEnd w:id="54"/>
+      <w:bookmarkEnd w:id="55"/>
     </w:p>
     <w:p>
       <w:pPr>
         <w:pStyle w:val="Ttulo3"/>
       </w:pPr>
-      <w:bookmarkStart w:id="55" w:name="_Toc243321372"/>
+      <w:bookmarkStart w:id="56" w:name="_Toc243321372"/>
       <w:r>
         <w:t>Fuentes Secundarias</w:t>
       </w:r>
-      <w:bookmarkEnd w:id="55"/>
+      <w:bookmarkEnd w:id="56"/>
     </w:p>
     <w:p>
       <w:pPr>
         <w:pStyle w:val="Ttulo2"/>
       </w:pPr>
-      <w:bookmarkStart w:id="56" w:name="_Toc243321373"/>
+      <w:bookmarkStart w:id="57" w:name="_Toc243321373"/>
       <w:r>
         <w:t>Resultados</w:t>
       </w:r>
-      <w:bookmarkEnd w:id="56"/>
+      <w:bookmarkEnd w:id="57"/>
     </w:p>
     <w:p>
       <w:pPr>
         <w:pStyle w:val="Ttulo1"/>
       </w:pPr>
-      <w:bookmarkStart w:id="57" w:name="_Toc243321374"/>
+      <w:bookmarkStart w:id="58" w:name="_Toc243321374"/>
+      <w:r>
+        <w:t>Capítulo V. Descripción del Trabajo Desarrollado</w:t>
+      </w:r>
+      <w:bookmarkEnd w:id="58"/>
+    </w:p>
+    <w:p>
+      <w:pPr>
+        <w:pStyle w:val="Nmerodecaptulo"/>
+        <w:rPr>
+          <w:lang w:val="es-ES_tradnl"/>
+        </w:rPr>
+      </w:pPr>
+    </w:p>
+    <w:p>
+      <w:pPr>
+        <w:pStyle w:val="Ttulo2"/>
+      </w:pPr>
+      <w:bookmarkStart w:id="59" w:name="_Toc243321375"/>
+      <w:r>
+        <w:t xml:space="preserve">Implementación de </w:t>
+      </w:r>
+      <w:proofErr w:type="spellStart"/>
+      <w:r>
+        <w:t>Inforum</w:t>
+      </w:r>
+      <w:proofErr w:type="spellEnd"/>
+      <w:r>
+        <w:t xml:space="preserve"> </w:t>
+      </w:r>
+      <w:proofErr w:type="spellStart"/>
+      <w:r>
+        <w:t>Go</w:t>
+      </w:r>
+      <w:bookmarkEnd w:id="59"/>
+      <w:proofErr w:type="spellEnd"/>
+    </w:p>
+    <w:p>
+      <w:pPr>
+        <w:pStyle w:val="Ttulo3"/>
+      </w:pPr>
+      <w:bookmarkStart w:id="60" w:name="_Toc243321376"/>
+      <w:r>
+        <w:t>Justificación</w:t>
+      </w:r>
+      <w:bookmarkEnd w:id="60"/>
+    </w:p>
+    <w:p>
+      <w:pPr>
+        <w:pStyle w:val="Ttulo3"/>
+      </w:pPr>
+      <w:bookmarkStart w:id="61" w:name="_Toc243321377"/>
+      <w:r>
+        <w:t>Alcance</w:t>
+      </w:r>
+      <w:bookmarkEnd w:id="61"/>
+    </w:p>
+    <w:p>
+      <w:pPr>
+        <w:pStyle w:val="Ttulo3"/>
+      </w:pPr>
+      <w:bookmarkStart w:id="62" w:name="_Toc243321378"/>
+      <w:r>
+        <w:t>Recursos Disponibles y Limitaciones</w:t>
+      </w:r>
+      <w:bookmarkEnd w:id="62"/>
+    </w:p>
+    <w:p>
+      <w:pPr>
+        <w:pStyle w:val="Ttulo3"/>
+      </w:pPr>
+      <w:bookmarkStart w:id="63" w:name="_Toc243321379"/>
+      <w:r>
+        <w:t>Actividades Desarrolladas</w:t>
+      </w:r>
+      <w:bookmarkEnd w:id="63"/>
+    </w:p>
+    <w:p>
+      <w:pPr>
+        <w:pStyle w:val="Ttulo3"/>
+      </w:pPr>
+      <w:bookmarkStart w:id="64" w:name="_Toc243321380"/>
+      <w:r>
+        <w:t>Resultados Obtenidos</w:t>
+      </w:r>
+      <w:bookmarkEnd w:id="64"/>
+    </w:p>
+    <w:p>
+      <w:pPr>
+        <w:pStyle w:val="Ttulo2"/>
+      </w:pPr>
+      <w:bookmarkStart w:id="65" w:name="_Toc243321381"/>
+      <w:r>
+        <w:t>Análisis Costo-Beneficio</w:t>
+      </w:r>
+      <w:bookmarkEnd w:id="65"/>
+    </w:p>
+    <w:p>
+      <w:pPr>
+        <w:pStyle w:val="Ttulo3"/>
+      </w:pPr>
+      <w:bookmarkStart w:id="66" w:name="_Toc243321382"/>
+      <w:r>
+        <w:t>Análisis de Costo Eléctrico</w:t>
+      </w:r>
+      <w:bookmarkEnd w:id="66"/>
+    </w:p>
+    <w:p>
+      <w:pPr>
+        <w:pStyle w:val="Ttulo3"/>
+      </w:pPr>
+      <w:bookmarkStart w:id="67" w:name="_Toc243321383"/>
+      <w:r>
+        <w:t>Análisis de Costo de Internet</w:t>
+      </w:r>
+      <w:bookmarkEnd w:id="67"/>
+    </w:p>
+    <w:p>
+      <w:pPr>
+        <w:pStyle w:val="Ttulo3"/>
+      </w:pPr>
+      <w:bookmarkStart w:id="68" w:name="_Toc243321384"/>
+      <w:r>
+        <w:t>Análisis de Costo Variados</w:t>
+      </w:r>
+      <w:bookmarkEnd w:id="68"/>
+    </w:p>
+    <w:p>
+      <w:pPr>
+        <w:pStyle w:val="Ttulo3"/>
+      </w:pPr>
+      <w:bookmarkStart w:id="69" w:name="_Toc243321385"/>
+      <w:r>
+        <w:t>Análisis de Costo Salarial</w:t>
+      </w:r>
+      <w:bookmarkEnd w:id="69"/>
+    </w:p>
+    <w:p>
+      <w:pPr>
+        <w:pStyle w:val="Ttulo3"/>
+      </w:pPr>
+      <w:bookmarkStart w:id="70" w:name="_Toc243321386"/>
+      <w:r>
+        <w:t>Análisis Financiero Costo Beneficio</w:t>
+      </w:r>
+      <w:bookmarkEnd w:id="70"/>
+    </w:p>
+    <w:p>
+      <w:pPr>
+        <w:pStyle w:val="Ttulo1"/>
+      </w:pPr>
+      <w:bookmarkStart w:id="71" w:name="_Toc243321387"/>
       <w:r>
         <w:lastRenderedPageBreak/>
-        <w:t>Capítulo V. Descripción del Trabajo Desarrollado</w:t>
-      </w:r>
-      <w:bookmarkEnd w:id="57"/>
-    </w:p>
-    <w:p>
-      <w:pPr>
-        <w:pStyle w:val="Nmerodecaptulo"/>
-        <w:rPr>
-          <w:lang w:val="es-ES_tradnl"/>
-        </w:rPr>
-      </w:pPr>
-    </w:p>
-    <w:p>
-      <w:pPr>
-        <w:pStyle w:val="Ttulo2"/>
-      </w:pPr>
-      <w:bookmarkStart w:id="58" w:name="_Toc243321375"/>
-      <w:r>
-        <w:t xml:space="preserve">Implementación de </w:t>
-      </w:r>
-      <w:proofErr w:type="spellStart"/>
-      <w:r>
-        <w:t>Inforum</w:t>
-      </w:r>
-      <w:proofErr w:type="spellEnd"/>
-      <w:r>
-        <w:t xml:space="preserve"> </w:t>
-      </w:r>
-      <w:proofErr w:type="spellStart"/>
-      <w:r>
-        <w:t>Go</w:t>
-      </w:r>
-      <w:bookmarkEnd w:id="58"/>
-      <w:proofErr w:type="spellEnd"/>
-    </w:p>
-    <w:p>
-      <w:pPr>
-        <w:pStyle w:val="Ttulo3"/>
-      </w:pPr>
-      <w:bookmarkStart w:id="59" w:name="_Toc243321376"/>
-      <w:r>
-        <w:t>Justificación</w:t>
-      </w:r>
-      <w:bookmarkEnd w:id="59"/>
-    </w:p>
-    <w:p>
-      <w:pPr>
-        <w:pStyle w:val="Ttulo3"/>
-      </w:pPr>
-      <w:bookmarkStart w:id="60" w:name="_Toc243321377"/>
-      <w:r>
-        <w:t>Alcance</w:t>
-      </w:r>
-      <w:bookmarkEnd w:id="60"/>
-    </w:p>
-    <w:p>
-      <w:pPr>
-        <w:pStyle w:val="Ttulo3"/>
-      </w:pPr>
-      <w:bookmarkStart w:id="61" w:name="_Toc243321378"/>
-      <w:r>
-        <w:t>Recursos Disponibles y Limitaciones</w:t>
-      </w:r>
-      <w:bookmarkEnd w:id="61"/>
-    </w:p>
-    <w:p>
-      <w:pPr>
-        <w:pStyle w:val="Ttulo3"/>
-      </w:pPr>
-      <w:bookmarkStart w:id="62" w:name="_Toc243321379"/>
-      <w:r>
-        <w:t>Actividades Desarrolladas</w:t>
-      </w:r>
-      <w:bookmarkEnd w:id="62"/>
-    </w:p>
-    <w:p>
-      <w:pPr>
-        <w:pStyle w:val="Ttulo3"/>
-      </w:pPr>
-      <w:bookmarkStart w:id="63" w:name="_Toc243321380"/>
-      <w:r>
-        <w:t>Resultados Obtenidos</w:t>
-      </w:r>
-      <w:bookmarkEnd w:id="63"/>
-    </w:p>
-    <w:p>
-      <w:pPr>
-        <w:pStyle w:val="Ttulo2"/>
-      </w:pPr>
-      <w:bookmarkStart w:id="64" w:name="_Toc243321381"/>
-      <w:r>
-        <w:t>Análisis Costo-Beneficio</w:t>
-      </w:r>
-      <w:bookmarkEnd w:id="64"/>
-    </w:p>
-    <w:p>
-      <w:pPr>
-        <w:pStyle w:val="Ttulo3"/>
-      </w:pPr>
-      <w:bookmarkStart w:id="65" w:name="_Toc243321382"/>
-      <w:r>
-        <w:t>Análisis de Costo Eléctrico</w:t>
-      </w:r>
-      <w:bookmarkEnd w:id="65"/>
-    </w:p>
-    <w:p>
-      <w:pPr>
-        <w:pStyle w:val="Ttulo3"/>
-      </w:pPr>
-      <w:bookmarkStart w:id="66" w:name="_Toc243321383"/>
-      <w:r>
-        <w:t>Análisis de Costo de Internet</w:t>
-      </w:r>
-      <w:bookmarkEnd w:id="66"/>
-    </w:p>
-    <w:p>
-      <w:pPr>
-        <w:pStyle w:val="Ttulo3"/>
-      </w:pPr>
-      <w:bookmarkStart w:id="67" w:name="_Toc243321384"/>
-      <w:r>
-        <w:t>Análisis de Costo Variados</w:t>
-      </w:r>
-      <w:bookmarkEnd w:id="67"/>
-    </w:p>
-    <w:p>
-      <w:pPr>
-        <w:pStyle w:val="Ttulo3"/>
-      </w:pPr>
-      <w:bookmarkStart w:id="68" w:name="_Toc243321385"/>
-      <w:r>
-        <w:t>Análisis de Costo Salarial</w:t>
-      </w:r>
-      <w:bookmarkEnd w:id="68"/>
-    </w:p>
-    <w:p>
-      <w:pPr>
-        <w:pStyle w:val="Ttulo3"/>
-      </w:pPr>
-      <w:bookmarkStart w:id="69" w:name="_Toc243321386"/>
-      <w:r>
-        <w:t>Análisis Financiero Costo Beneficio</w:t>
-      </w:r>
-      <w:bookmarkEnd w:id="69"/>
+        <w:t>Capítulo VI Conclusiones</w:t>
+      </w:r>
+      <w:bookmarkEnd w:id="71"/>
     </w:p>
     <w:p>
       <w:pPr>
         <w:pStyle w:val="Ttulo1"/>
       </w:pPr>
-      <w:bookmarkStart w:id="70" w:name="_Toc243321387"/>
-      <w:r>
-        <w:t>Capítulo VI Conclusiones</w:t>
-      </w:r>
-      <w:bookmarkEnd w:id="70"/>
+      <w:bookmarkStart w:id="72" w:name="_Toc243321388"/>
+      <w:r>
+        <w:t>Capítulo VII Recomendaciones</w:t>
+      </w:r>
+      <w:bookmarkEnd w:id="72"/>
+    </w:p>
+    <w:p>
+      <w:pPr>
+        <w:rPr>
+          <w:lang w:val="es-ES_tradnl"/>
+        </w:rPr>
+      </w:pPr>
+    </w:p>
+    <w:p>
+      <w:pPr>
+        <w:rPr>
+          <w:lang w:val="es-ES_tradnl"/>
+        </w:rPr>
+      </w:pPr>
+    </w:p>
+    <w:p>
+      <w:pPr>
+        <w:rPr>
+          <w:lang w:val="es-ES_tradnl"/>
+        </w:rPr>
+      </w:pPr>
+    </w:p>
+    <w:p>
+      <w:pPr>
+        <w:rPr>
+          <w:lang w:val="es-ES_tradnl"/>
+        </w:rPr>
+      </w:pPr>
+    </w:p>
+    <w:p>
+      <w:pPr>
+        <w:rPr>
+          <w:lang w:val="es-ES_tradnl"/>
+        </w:rPr>
+      </w:pPr>
     </w:p>
     <w:p>
       <w:pPr>
         <w:pStyle w:val="Ttulo1"/>
       </w:pPr>
-      <w:bookmarkStart w:id="71" w:name="_Toc243321388"/>
-      <w:r>
-        <w:t>Capítulo VII Recomendaciones</w:t>
-      </w:r>
-      <w:bookmarkEnd w:id="71"/>
-    </w:p>
-    <w:p>
-      <w:pPr>
-        <w:rPr>
-          <w:lang w:val="es-ES_tradnl"/>
-        </w:rPr>
-      </w:pPr>
-    </w:p>
-    <w:p>
-      <w:pPr>
-        <w:rPr>
-          <w:lang w:val="es-ES_tradnl"/>
-        </w:rPr>
-      </w:pPr>
-    </w:p>
-    <w:p>
-      <w:pPr>
-        <w:rPr>
-          <w:lang w:val="es-ES_tradnl"/>
-        </w:rPr>
-      </w:pPr>
-    </w:p>
-    <w:p>
-      <w:pPr>
-        <w:rPr>
-          <w:lang w:val="es-ES_tradnl"/>
-        </w:rPr>
-      </w:pPr>
-    </w:p>
-    <w:p>
-      <w:pPr>
-        <w:pStyle w:val="Ttulo1"/>
-      </w:pPr>
-      <w:bookmarkStart w:id="72" w:name="_Toc243321389"/>
-      <w:r>
-        <w:lastRenderedPageBreak/>
+      <w:bookmarkStart w:id="73" w:name="_Toc243321389"/>
+      <w:r>
         <w:t>Bibliografía</w:t>
       </w:r>
-      <w:bookmarkEnd w:id="72"/>
+      <w:bookmarkEnd w:id="73"/>
     </w:p>
     <w:sdt>
       <w:sdtPr>
@@ -18114,6 +18626,7 @@
   <w:style w:type="character" w:default="1" w:styleId="Fuentedeprrafopredeter">
     <w:name w:val="Default Paragraph Font"/>
     <w:uiPriority w:val="1"/>
+    <w:semiHidden/>
     <w:unhideWhenUsed/>
   </w:style>
   <w:style w:type="table" w:default="1" w:styleId="Tablanormal">
@@ -18734,6 +19247,33 @@
     <w:unhideWhenUsed/>
     <w:rsid w:val="002F634F"/>
   </w:style>
+  <w:style w:type="paragraph" w:styleId="Descripcin">
+    <w:name w:val="caption"/>
+    <w:basedOn w:val="Normal"/>
+    <w:next w:val="Normal"/>
+    <w:uiPriority w:val="35"/>
+    <w:unhideWhenUsed/>
+    <w:qFormat/>
+    <w:rsid w:val="00DB4DCC"/>
+    <w:pPr>
+      <w:spacing w:after="200" w:line="240" w:lineRule="auto"/>
+    </w:pPr>
+    <w:rPr>
+      <w:i/>
+      <w:iCs/>
+      <w:color w:val="44546A" w:themeColor="text2"/>
+      <w:sz w:val="18"/>
+      <w:szCs w:val="18"/>
+    </w:rPr>
+  </w:style>
+  <w:style w:type="paragraph" w:styleId="Tabladeilustraciones">
+    <w:name w:val="table of figures"/>
+    <w:basedOn w:val="Normal"/>
+    <w:next w:val="Normal"/>
+    <w:uiPriority w:val="99"/>
+    <w:unhideWhenUsed/>
+    <w:rsid w:val="00DB4DCC"/>
+  </w:style>
 </w:styles>
 </file>
 

</xml_diff>